<commit_message>
Add drive and github links to report
</commit_message>
<xml_diff>
--- a/BaoCao_LAB1_6551071078.docx
+++ b/BaoCao_LAB1_6551071078.docx
@@ -262,7 +262,7 @@
         <w:rPr>
           <w:rFonts w:ascii="Verdana" w:hAnsi="Verdana"/>
         </w:rPr>
-        <w:t>https://github.com/hongthien06/6551071078_MAP_APP</w:t>
+        <w:t>https://github.com/hongthien06/6551071078_MAP_APP.git</w:t>
       </w:r>
     </w:p>
     <w:p>
@@ -336,7 +336,7 @@
         <w:rPr>
           <w:rFonts w:ascii="Verdana" w:hAnsi="Verdana"/>
         </w:rPr>
-        <w:t>…//link</w:t>
+        <w:t>https://drive.google.com/drive/folders/153x2rE-JxE2raA35pJW7cm72PGRGGpF-?usp=sharing</w:t>
       </w:r>
     </w:p>
     <w:p/>

</xml_diff>